<commit_message>
Fachbezug selbstbewusster, das Thema ist gutgeheissen
Der Abschnitt fing defensiv an - "der Einwand sei vorweggenommen". Das
passt, wenn man um ein Thema kaempfen muss, aber Dr. Rosenschon findet es
gut. Neuer Einstieg: Automatisierungstechnik ist heute zu einem
erheblichen Teil Softwaretechnik, der Gegenstand ist ungewoehnlich, die
Methode nicht.

Die Abgrenzung bleibt drin, aber als Festlegung des Themas statt als
Eingestaendnis.

Co-Authored-By: Claude Opus 5 <noreply@anthropic.com>
</commit_message>
<xml_diff>
--- a/mappe/Zmaj Kapitel 1.docx
+++ b/mappe/Zmaj Kapitel 1.docx
@@ -596,7 +596,7 @@
           <w:sz w:val="22"/>
           <w:szCs w:val="22"/>
         </w:rPr>
-        <w:t xml:space="preserve">Eine Sprachlernanwendung ist auf den ersten Blick kein Gegenstand der Automatisierungstechnik. Der Einwand sei deshalb vorweggenommen, bevor er entsteht.</w:t>
+        <w:t xml:space="preserve">Automatisierungstechnik ist heute zu einem erheblichen Teil Softwaretechnik. Ob eine Ablaufsteuerung in einer speicherprogrammierbaren Steuerung, in einer Visualisierung oder in einer mobilen Anwendung läuft, ändert nichts an den Fragen, die beim Entwurf zu beantworten sind. Der Gegenstand dieser Arbeit ist ungewöhnlich, die Methode ist es nicht.</w:t>
       </w:r>
     </w:p>
     <w:p>
@@ -612,15 +612,15 @@
           <w:sz w:val="22"/>
           <w:szCs w:val="22"/>
         </w:rPr>
-        <w:t xml:space="preserve">Was diese Arbeit nicht enthält:</w:t>
-      </w:r>
-      <w:r>
-        <w:rPr>
-          <w:rFonts w:ascii="Calibri" w:cs="Calibri" w:eastAsia="Calibri" w:hAnsi="Calibri"/>
-          <w:sz w:val="22"/>
-          <w:szCs w:val="22"/>
-        </w:rPr>
-        <w:t xml:space="preserve"> keine Sensorik, keine Antriebe, keine speicherprogrammierbare Steuerung, keinen Feldbus und keinen physikalischen Prozess. Es gibt keine Messgrößen in physikalischen Einheiten und folglich auch keine Regelstrecke, die sich mit einer Übertragungsfunktion beschreiben ließe.</w:t>
+        <w:t xml:space="preserve">Zur Abgrenzung:</w:t>
+      </w:r>
+      <w:r>
+        <w:rPr>
+          <w:rFonts w:ascii="Calibri" w:cs="Calibri" w:eastAsia="Calibri" w:hAnsi="Calibri"/>
+          <w:sz w:val="22"/>
+          <w:szCs w:val="22"/>
+        </w:rPr>
+        <w:t xml:space="preserve"> Die Arbeit enthält keine Sensorik, keine Antriebe, keine speicherprogrammierbare Steuerung, keinen Feldbus und keinen physikalischen Prozess. Es gibt keine Messgrößen in physikalischen Einheiten und folglich auch keine Regelstrecke, die sich mit einer Übertragungsfunktion beschreiben ließe. Das ist kein Mangel, sondern eine Festlegung des Themas – und sie wird hier ausdrücklich genannt, damit der fachliche Kern dort gesucht wird, wo er tatsächlich liegt.</w:t>
       </w:r>
     </w:p>
     <w:p>
@@ -634,7 +634,7 @@
           <w:sz w:val="22"/>
           <w:szCs w:val="22"/>
         </w:rPr>
-        <w:t xml:space="preserve">Der Bezug liegt nicht im Gegenstand, sondern in den Entwurfsfragen. Beim Entwurf einer Ablaufsteuerung sind stets dieselben fünf Fragen zu beantworten, gleich ob die Anlage ein Ofen, ein Förderband oder ein Lernablauf ist:</w:t>
+        <w:t xml:space="preserve">Beim Entwurf einer Ablaufsteuerung sind stets dieselben fünf Fragen zu beantworten, gleich ob die Anlage ein Ofen, ein Förderband oder ein Lernablauf ist:</w:t>
       </w:r>
     </w:p>
     <w:p>

</xml_diff>

<commit_message>
Die Word-Datei im Projekt war noch die Fassung ohne Logo
Sie liess sich beim letzten Mal nicht ueberschreiben, weil Word sie offen
hielt - und genau die hat Ajdin dann angesehen. Jetzt ist die richtige
drin: 31 kB statt 14 kB, zwei Bilder statt keinem.

Co-Authored-By: Claude Opus 5 <noreply@anthropic.com>
</commit_message>
<xml_diff>
--- a/mappe/Zmaj Kapitel 1.docx
+++ b/mappe/Zmaj Kapitel 1.docx
@@ -47,7 +47,7 @@
         <w:pBdr>
           <w:top w:val="single" w:color="2E5496" w:sz="6" w:space="12"/>
         </w:pBdr>
-        <w:spacing w:after="600"/>
+        <w:spacing w:after="400"/>
         <w:jc w:val="center"/>
       </w:pPr>
       <w:r>
@@ -58,6 +58,52 @@
           <w:szCs w:val="24"/>
         </w:rPr>
         <w:t xml:space="preserve">Eine Android-Anwendung von der Idee bis zur Veröffentlichung</w:t>
+      </w:r>
+    </w:p>
+    <w:p>
+      <w:pPr>
+        <w:spacing w:after="400"/>
+        <w:jc w:val="center"/>
+      </w:pPr>
+      <w:r>
+        <w:drawing>
+          <wp:inline distT="0" distB="0" distL="0" distR="0">
+            <wp:extent cx="2514600" cy="838200"/>
+            <wp:effectExtent t="0" r="0" b="0" l="0"/>
+            <wp:docPr id="1" name="" descr="" title=""/>
+            <wp:cNvGraphicFramePr>
+              <a:graphicFrameLocks xmlns:a="http://schemas.openxmlformats.org/drawingml/2006/main" noChangeAspect="1"/>
+            </wp:cNvGraphicFramePr>
+            <a:graphic xmlns:a="http://schemas.openxmlformats.org/drawingml/2006/main">
+              <a:graphicData uri="http://schemas.openxmlformats.org/drawingml/2006/picture">
+                <pic:pic xmlns:pic="http://schemas.openxmlformats.org/drawingml/2006/picture">
+                  <pic:nvPicPr>
+                    <pic:cNvPr id="0" name="" descr=""/>
+                    <pic:cNvPicPr>
+                      <a:picLocks noChangeAspect="1" noChangeArrowheads="1"/>
+                    </pic:cNvPicPr>
+                  </pic:nvPicPr>
+                  <pic:blipFill>
+                    <a:blip r:embed="rId9" cstate="none"/>
+                    <a:srcRect/>
+                    <a:stretch>
+                      <a:fillRect/>
+                    </a:stretch>
+                  </pic:blipFill>
+                  <pic:spPr bwMode="auto">
+                    <a:xfrm>
+                      <a:off x="0" y="0"/>
+                      <a:ext cx="2514600" cy="838200"/>
+                    </a:xfrm>
+                    <a:prstGeom prst="rect">
+                      <a:avLst/>
+                    </a:prstGeom>
+                  </pic:spPr>
+                </pic:pic>
+              </a:graphicData>
+            </a:graphic>
+          </wp:inline>
+        </w:drawing>
       </w:r>
     </w:p>
     <w:p>
@@ -154,9 +200,14 @@
       </w:r>
     </w:p>
     <w:p>
-      <w:r>
-        <w:br w:type="page"/>
-      </w:r>
+      <w:pPr>
+        <w:sectPr>
+          <w:pgSz w:w="11906" w:h="16838" w:orient="portrait"/>
+          <w:pgMar w:top="1418" w:right="1418" w:bottom="1418" w:left="1418" w:header="708" w:footer="708" w:gutter="0"/>
+          <w:pgNumType/>
+          <w:docGrid w:linePitch="360"/>
+        </w:sectPr>
+      </w:pPr>
     </w:p>
     <w:p>
       <w:pPr>
@@ -1536,7 +1587,8 @@
       </w:r>
     </w:p>
     <w:sectPr>
-      <w:footerReference w:type="default" r:id="rId7"/>
+      <w:headerReference w:type="default" r:id="rId7"/>
+      <w:footerReference w:type="default" r:id="rId8"/>
       <w:pgSz w:w="11906" w:h="16838" w:orient="portrait"/>
       <w:pgMar w:top="1418" w:right="1134" w:bottom="1418" w:left="1701" w:header="708" w:footer="708" w:gutter="0"/>
       <w:pgNumType/>
@@ -1688,6 +1740,57 @@
     </w:p>
   </w:footnote>
 </w:footnotes>
+</file>
+
+<file path=word/header1.xml><?xml version="1.0" encoding="utf-8"?>
+<w:hdr xmlns:wpc="http://schemas.microsoft.com/office/word/2010/wordprocessingCanvas" xmlns:mc="http://schemas.openxmlformats.org/markup-compatibility/2006" xmlns:o="urn:schemas-microsoft-com:office:office" xmlns:r="http://schemas.openxmlformats.org/officeDocument/2006/relationships" xmlns:m="http://schemas.openxmlformats.org/officeDocument/2006/math" xmlns:v="urn:schemas-microsoft-com:vml" xmlns:wp14="http://schemas.microsoft.com/office/word/2010/wordprocessingDrawing" xmlns:wp="http://schemas.openxmlformats.org/drawingml/2006/wordprocessingDrawing" xmlns:w10="urn:schemas-microsoft-com:office:word" xmlns:w="http://schemas.openxmlformats.org/wordprocessingml/2006/main" xmlns:w14="http://schemas.microsoft.com/office/word/2010/wordml" xmlns:w15="http://schemas.microsoft.com/office/word/2012/wordml" xmlns:wpg="http://schemas.microsoft.com/office/word/2010/wordprocessingGroup" xmlns:wpi="http://schemas.microsoft.com/office/word/2010/wordprocessingInk" xmlns:wne="http://schemas.microsoft.com/office/word/2006/wordml" xmlns:wps="http://schemas.microsoft.com/office/word/2010/wordprocessingShape" xmlns:cx="http://schemas.microsoft.com/office/drawing/2014/chartex" xmlns:cx1="http://schemas.microsoft.com/office/drawing/2015/9/8/chartex" xmlns:cx2="http://schemas.microsoft.com/office/drawing/2015/10/21/chartex" xmlns:cx3="http://schemas.microsoft.com/office/drawing/2016/5/9/chartex" xmlns:cx4="http://schemas.microsoft.com/office/drawing/2016/5/10/chartex" xmlns:cx5="http://schemas.microsoft.com/office/drawing/2016/5/11/chartex" xmlns:cx6="http://schemas.microsoft.com/office/drawing/2016/5/12/chartex" xmlns:cx7="http://schemas.microsoft.com/office/drawing/2016/5/13/chartex" xmlns:cx8="http://schemas.microsoft.com/office/drawing/2016/5/14/chartex" xmlns:w16cid="http://schemas.microsoft.com/office/word/2016/wordml/cid" xmlns:w16se="http://schemas.microsoft.com/office/word/2015/wordml/symex">
+  <w:p>
+    <w:pPr>
+      <w:spacing w:after="120"/>
+      <w:jc w:val="left"/>
+    </w:pPr>
+    <w:r>
+      <w:drawing>
+        <wp:inline distT="0" distB="0" distL="0" distR="0">
+          <wp:extent cx="1438275" cy="476250"/>
+          <wp:effectExtent t="0" r="0" b="0" l="0"/>
+          <wp:docPr id="1" name="" descr="" title=""/>
+          <wp:cNvGraphicFramePr>
+            <a:graphicFrameLocks xmlns:a="http://schemas.openxmlformats.org/drawingml/2006/main" noChangeAspect="1"/>
+          </wp:cNvGraphicFramePr>
+          <a:graphic xmlns:a="http://schemas.openxmlformats.org/drawingml/2006/main">
+            <a:graphicData uri="http://schemas.openxmlformats.org/drawingml/2006/picture">
+              <pic:pic xmlns:pic="http://schemas.openxmlformats.org/drawingml/2006/picture">
+                <pic:nvPicPr>
+                  <pic:cNvPr id="0" name="" descr=""/>
+                  <pic:cNvPicPr>
+                    <a:picLocks noChangeAspect="1" noChangeArrowheads="1"/>
+                  </pic:cNvPicPr>
+                </pic:nvPicPr>
+                <pic:blipFill>
+                  <a:blip r:embed="rId0" cstate="none"/>
+                  <a:srcRect/>
+                  <a:stretch>
+                    <a:fillRect/>
+                  </a:stretch>
+                </pic:blipFill>
+                <pic:spPr bwMode="auto">
+                  <a:xfrm>
+                    <a:off x="0" y="0"/>
+                    <a:ext cx="1438275" cy="476250"/>
+                  </a:xfrm>
+                  <a:prstGeom prst="rect">
+                    <a:avLst/>
+                  </a:prstGeom>
+                </pic:spPr>
+              </pic:pic>
+            </a:graphicData>
+          </a:graphic>
+        </wp:inline>
+      </w:drawing>
+    </w:r>
+  </w:p>
+</w:hdr>
 </file>
 
 <file path=word/numbering.xml><?xml version="1.0" encoding="utf-8"?>

</xml_diff>

<commit_message>
Deckblatt nach Entwurf 4, in Word gesetzt
Nicht als Bild, sondern zweischichtig: Der Hintergrund - Farbflaechen,
Logo, Telefon, gelber Strich - ist ein Bild hinter dem Text. Die Schrift
selbst ist echter Word-Text und bleibt markierbar, durchsuchbar und
korrigierbar. Ein Deckblatt, das nur ein Bild ist, kann niemand mehr
aendern, ohne das Bauskript zu haben.

Die Positionen stammen aus dem Entwurf (1240 x 1754 px, A4 bei 150 dpi)
und werden in Word-Twips umgerechnet. Im SVG steht bei y die Grundlinie,
Word misst von oben - deshalb je 0,8 mal Schriftgroesse hoeher.

Beim Nachsehen im Rendering fiel auf, dass Word die Schrift ein paar Pixel
tiefer setzt als der SVG-Renderer: Der gelbe Strich klebte an der
Unterkante von ZMAJ. Titel um 12 px angehoben, jetzt stimmt der Abstand.

Co-Authored-By: Claude Opus 5 <noreply@anthropic.com>
</commit_message>
<xml_diff>
--- a/mappe/Zmaj Kapitel 1.docx
+++ b/mappe/Zmaj Kapitel 1.docx
@@ -2,74 +2,23 @@
 <file path=word/document.xml><?xml version="1.0" encoding="utf-8"?>
 <w:document xmlns:wpc="http://schemas.microsoft.com/office/word/2010/wordprocessingCanvas" xmlns:mc="http://schemas.openxmlformats.org/markup-compatibility/2006" xmlns:o="urn:schemas-microsoft-com:office:office" xmlns:r="http://schemas.openxmlformats.org/officeDocument/2006/relationships" xmlns:m="http://schemas.openxmlformats.org/officeDocument/2006/math" xmlns:v="urn:schemas-microsoft-com:vml" xmlns:wp14="http://schemas.microsoft.com/office/word/2010/wordprocessingDrawing" xmlns:wp="http://schemas.openxmlformats.org/drawingml/2006/wordprocessingDrawing" xmlns:w10="urn:schemas-microsoft-com:office:word" xmlns:w="http://schemas.openxmlformats.org/wordprocessingml/2006/main" xmlns:w14="http://schemas.microsoft.com/office/word/2010/wordml" xmlns:w15="http://schemas.microsoft.com/office/word/2012/wordml" xmlns:wpg="http://schemas.microsoft.com/office/word/2010/wordprocessingGroup" xmlns:wpi="http://schemas.microsoft.com/office/word/2010/wordprocessingInk" xmlns:wne="http://schemas.microsoft.com/office/word/2006/wordml" xmlns:wps="http://schemas.microsoft.com/office/word/2010/wordprocessingShape" xmlns:cx="http://schemas.microsoft.com/office/drawing/2014/chartex" xmlns:cx1="http://schemas.microsoft.com/office/drawing/2015/9/8/chartex" xmlns:cx2="http://schemas.microsoft.com/office/drawing/2015/10/21/chartex" xmlns:cx3="http://schemas.microsoft.com/office/drawing/2016/5/9/chartex" xmlns:cx4="http://schemas.microsoft.com/office/drawing/2016/5/10/chartex" xmlns:cx5="http://schemas.microsoft.com/office/drawing/2016/5/11/chartex" xmlns:cx6="http://schemas.microsoft.com/office/drawing/2016/5/12/chartex" xmlns:cx7="http://schemas.microsoft.com/office/drawing/2016/5/13/chartex" xmlns:cx8="http://schemas.microsoft.com/office/drawing/2016/5/14/chartex" xmlns:aink="http://schemas.microsoft.com/office/drawing/2016/ink" xmlns:am3d="http://schemas.microsoft.com/office/drawing/2017/model3d" xmlns:w16cex="http://schemas.microsoft.com/office/word/2018/wordml/cex" xmlns:w16cid="http://schemas.microsoft.com/office/word/2016/wordml/cid" xmlns:w16="http://schemas.microsoft.com/office/word/2018/wordml" xmlns:w16sdtdh="http://schemas.microsoft.com/office/word/2020/wordml/sdtdatahash" xmlns:w16se="http://schemas.microsoft.com/office/word/2015/wordml/symex" mc:Ignorable="w14 w15 wp14">
   <w:body>
-    <w:p/>
-    <w:p/>
-    <w:p/>
-    <w:p/>
-    <w:p/>
-    <w:p/>
-    <w:p>
-      <w:pPr>
-        <w:spacing w:after="0"/>
-        <w:jc w:val="center"/>
-      </w:pPr>
-      <w:r>
-        <w:rPr>
-          <w:rFonts w:ascii="Calibri Light" w:cs="Calibri Light" w:eastAsia="Calibri Light" w:hAnsi="Calibri Light"/>
-          <w:b/>
-          <w:bCs/>
-          <w:color w:val="1F3864"/>
-          <w:sz w:val="96"/>
-          <w:szCs w:val="96"/>
-        </w:rPr>
-        <w:t xml:space="preserve">ZMAJ</w:t>
-      </w:r>
-    </w:p>
-    <w:p>
-      <w:pPr>
-        <w:spacing w:after="240"/>
-        <w:jc w:val="center"/>
-      </w:pPr>
-      <w:r>
-        <w:rPr>
-          <w:rFonts w:ascii="Calibri Light" w:cs="Calibri Light" w:eastAsia="Calibri Light" w:hAnsi="Calibri Light"/>
-          <w:b/>
-          <w:bCs/>
-          <w:color w:val="2E5496"/>
-          <w:sz w:val="44"/>
-          <w:szCs w:val="44"/>
-        </w:rPr>
-        <w:t xml:space="preserve">BOSNISCH LERNEN</w:t>
-      </w:r>
-    </w:p>
-    <w:p>
-      <w:pPr>
-        <w:pBdr>
-          <w:top w:val="single" w:color="2E5496" w:sz="6" w:space="12"/>
-        </w:pBdr>
-        <w:spacing w:after="400"/>
-        <w:jc w:val="center"/>
-      </w:pPr>
-      <w:r>
-        <w:rPr>
-          <w:rFonts w:ascii="Calibri" w:cs="Calibri" w:eastAsia="Calibri" w:hAnsi="Calibri"/>
-          <w:color w:val="404040"/>
-          <w:sz w:val="24"/>
-          <w:szCs w:val="24"/>
-        </w:rPr>
-        <w:t xml:space="preserve">Eine Android-Anwendung von der Idee bis zur Veröffentlichung</w:t>
-      </w:r>
-    </w:p>
-    <w:p>
-      <w:pPr>
-        <w:spacing w:after="400"/>
-        <w:jc w:val="center"/>
+    <w:p>
+      <w:pPr>
+        <w:spacing w:after="0" w:line="20" w:lineRule="exact"/>
       </w:pPr>
       <w:r>
         <w:drawing>
-          <wp:inline distT="0" distB="0" distL="0" distR="0">
-            <wp:extent cx="2514600" cy="838200"/>
+          <wp:anchor distT="0" distB="0" distL="0" distR="0" simplePos="0" allowOverlap="1" behindDoc="1" locked="0" layoutInCell="1" relativeHeight="10696575">
+            <wp:simplePos x="0" y="0"/>
+            <wp:positionH relativeFrom="page">
+              <wp:posOffset>0</wp:posOffset>
+            </wp:positionH>
+            <wp:positionV relativeFrom="page">
+              <wp:posOffset>0</wp:posOffset>
+            </wp:positionV>
+            <wp:extent cx="7562850" cy="10696575"/>
             <wp:effectExtent t="0" r="0" b="0" l="0"/>
+            <wp:wrapNone/>
             <wp:docPr id="1" name="" descr="" title=""/>
             <wp:cNvGraphicFramePr>
               <a:graphicFrameLocks xmlns:a="http://schemas.openxmlformats.org/drawingml/2006/main" noChangeAspect="1"/>
@@ -93,7 +42,7 @@
                   <pic:spPr bwMode="auto">
                     <a:xfrm>
                       <a:off x="0" y="0"/>
-                      <a:ext cx="2514600" cy="838200"/>
+                      <a:ext cx="7562850" cy="10696575"/>
                     </a:xfrm>
                     <a:prstGeom prst="rect">
                       <a:avLst/>
@@ -102,97 +51,198 @@
                 </pic:pic>
               </a:graphicData>
             </a:graphic>
-          </wp:inline>
+          </wp:anchor>
         </w:drawing>
       </w:r>
     </w:p>
     <w:p>
       <w:pPr>
-        <w:spacing w:after="120"/>
-        <w:jc w:val="center"/>
-      </w:pPr>
-      <w:r>
-        <w:rPr>
-          <w:rFonts w:ascii="Calibri" w:cs="Calibri" w:eastAsia="Calibri" w:hAnsi="Calibri"/>
+        <w:spacing w:after="0" w:before="3706" w:line="1413" w:lineRule="exact"/>
+      </w:pPr>
+      <w:r>
+        <w:rPr>
+          <w:rFonts w:ascii="Segoe UI Light" w:cs="Segoe UI Light" w:eastAsia="Segoe UI Light" w:hAnsi="Segoe UI Light"/>
+          <w:b w:val="false"/>
+          <w:bCs w:val="false"/>
+          <w:color w:val="FFFFFF"/>
+          <w:spacing w:val="96"/>
+          <w:sz w:val="123"/>
+          <w:szCs w:val="123"/>
+        </w:rPr>
+        <w:t xml:space="preserve">ZMAJ</w:t>
+      </w:r>
+    </w:p>
+    <w:p>
+      <w:pPr>
+        <w:spacing w:after="0" w:before="430" w:line="420" w:lineRule="exact"/>
+      </w:pPr>
+      <w:r>
+        <w:rPr>
+          <w:rFonts w:ascii="Segoe UI" w:cs="Segoe UI" w:eastAsia="Segoe UI" w:hAnsi="Segoe UI"/>
           <w:b/>
           <w:bCs/>
-          <w:sz w:val="30"/>
-          <w:szCs w:val="30"/>
-        </w:rPr>
-        <w:t xml:space="preserve">AJDIN HASIĆ</w:t>
-      </w:r>
-    </w:p>
-    <w:p>
-      <w:pPr>
-        <w:spacing w:after="60"/>
-        <w:jc w:val="center"/>
-      </w:pPr>
-      <w:r>
-        <w:rPr>
-          <w:rFonts w:ascii="Calibri" w:cs="Calibri" w:eastAsia="Calibri" w:hAnsi="Calibri"/>
-          <w:color w:val="404040"/>
-          <w:sz w:val="22"/>
-          <w:szCs w:val="22"/>
+          <w:color w:val="4F76E8"/>
+          <w:spacing w:val="38"/>
+          <w:sz w:val="36"/>
+          <w:szCs w:val="36"/>
+        </w:rPr>
+        <w:t xml:space="preserve">BOSNISCH LERNEN</w:t>
+      </w:r>
+    </w:p>
+    <w:p>
+      <w:pPr>
+        <w:spacing w:after="0" w:before="454" w:line="287" w:lineRule="exact"/>
+      </w:pPr>
+      <w:r>
+        <w:rPr>
+          <w:rFonts w:ascii="Segoe UI" w:cs="Segoe UI" w:eastAsia="Segoe UI" w:hAnsi="Segoe UI"/>
+          <w:b w:val="false"/>
+          <w:bCs w:val="false"/>
+          <w:color w:val="AAB6D8"/>
+          <w:sz w:val="25"/>
+          <w:szCs w:val="25"/>
+        </w:rPr>
+        <w:t xml:space="preserve">Eine Android-Anwendung von der</w:t>
+      </w:r>
+    </w:p>
+    <w:p>
+      <w:pPr>
+        <w:spacing w:after="0" w:before="78" w:line="287" w:lineRule="exact"/>
+      </w:pPr>
+      <w:r>
+        <w:rPr>
+          <w:rFonts w:ascii="Segoe UI" w:cs="Segoe UI" w:eastAsia="Segoe UI" w:hAnsi="Segoe UI"/>
+          <w:b w:val="false"/>
+          <w:bCs w:val="false"/>
+          <w:color w:val="AAB6D8"/>
+          <w:sz w:val="25"/>
+          <w:szCs w:val="25"/>
+        </w:rPr>
+        <w:t xml:space="preserve">Idee bis zur Veröffentlichung</w:t>
+      </w:r>
+    </w:p>
+    <w:p>
+      <w:pPr>
+        <w:spacing w:after="0" w:before="721" w:line="254" w:lineRule="exact"/>
+      </w:pPr>
+      <w:r>
+        <w:rPr>
+          <w:rFonts w:ascii="Segoe UI" w:cs="Segoe UI" w:eastAsia="Segoe UI" w:hAnsi="Segoe UI"/>
+          <w:b w:val="false"/>
+          <w:bCs w:val="false"/>
+          <w:color w:val="6B7BA8"/>
+          <w:sz w:val="22"/>
+          <w:szCs w:val="22"/>
+        </w:rPr>
+        <w:t xml:space="preserve">Projektarbeit zur Weiterbildung zum</w:t>
+      </w:r>
+    </w:p>
+    <w:p>
+      <w:pPr>
+        <w:spacing w:after="0" w:before="92" w:line="254" w:lineRule="exact"/>
+      </w:pPr>
+      <w:r>
+        <w:rPr>
+          <w:rFonts w:ascii="Segoe UI" w:cs="Segoe UI" w:eastAsia="Segoe UI" w:hAnsi="Segoe UI"/>
+          <w:b w:val="false"/>
+          <w:bCs w:val="false"/>
+          <w:color w:val="6B7BA8"/>
+          <w:sz w:val="22"/>
+          <w:szCs w:val="22"/>
+        </w:rPr>
+        <w:t xml:space="preserve">staatlich geprüften Techniker</w:t>
+      </w:r>
+    </w:p>
+    <w:p>
+      <w:pPr>
+        <w:spacing w:after="0" w:before="4067" w:line="442" w:lineRule="exact"/>
+      </w:pPr>
+      <w:r>
+        <w:rPr>
+          <w:rFonts w:ascii="Segoe UI" w:cs="Segoe UI" w:eastAsia="Segoe UI" w:hAnsi="Segoe UI"/>
+          <w:b/>
+          <w:bCs/>
+          <w:color w:val="1A1A1A"/>
+          <w:sz w:val="38"/>
+          <w:szCs w:val="38"/>
+        </w:rPr>
+        <w:t xml:space="preserve">Ajdin Hasić</w:t>
+      </w:r>
+    </w:p>
+    <w:p>
+      <w:pPr>
+        <w:spacing w:after="0" w:before="163" w:line="287" w:lineRule="exact"/>
+      </w:pPr>
+      <w:r>
+        <w:rPr>
+          <w:rFonts w:ascii="Segoe UI" w:cs="Segoe UI" w:eastAsia="Segoe UI" w:hAnsi="Segoe UI"/>
+          <w:b w:val="false"/>
+          <w:bCs w:val="false"/>
+          <w:color w:val="444444"/>
+          <w:sz w:val="25"/>
+          <w:szCs w:val="25"/>
         </w:rPr>
         <w:t xml:space="preserve">Klasse 02FSA · Fachrichtung Automatisierungstechnik</w:t>
       </w:r>
     </w:p>
     <w:p>
       <w:pPr>
-        <w:spacing w:after="60"/>
-        <w:jc w:val="center"/>
-      </w:pPr>
-      <w:r>
-        <w:rPr>
-          <w:rFonts w:ascii="Calibri" w:cs="Calibri" w:eastAsia="Calibri" w:hAnsi="Calibri"/>
-          <w:color w:val="404040"/>
-          <w:sz w:val="22"/>
-          <w:szCs w:val="22"/>
+        <w:spacing w:after="0" w:before="212" w:line="287" w:lineRule="exact"/>
+      </w:pPr>
+      <w:r>
+        <w:rPr>
+          <w:rFonts w:ascii="Segoe UI" w:cs="Segoe UI" w:eastAsia="Segoe UI" w:hAnsi="Segoe UI"/>
+          <w:b w:val="false"/>
+          <w:bCs w:val="false"/>
+          <w:color w:val="444444"/>
+          <w:sz w:val="25"/>
+          <w:szCs w:val="25"/>
         </w:rPr>
         <w:t xml:space="preserve">Berufs- und Technikerschule Butzbach</w:t>
       </w:r>
     </w:p>
     <w:p>
       <w:pPr>
-        <w:spacing w:after="60"/>
-        <w:jc w:val="center"/>
-      </w:pPr>
-      <w:r>
-        <w:rPr>
-          <w:rFonts w:ascii="Calibri" w:cs="Calibri" w:eastAsia="Calibri" w:hAnsi="Calibri"/>
-          <w:color w:val="404040"/>
-          <w:sz w:val="22"/>
-          <w:szCs w:val="22"/>
+        <w:spacing w:after="0" w:before="212" w:line="287" w:lineRule="exact"/>
+      </w:pPr>
+      <w:r>
+        <w:rPr>
+          <w:rFonts w:ascii="Segoe UI" w:cs="Segoe UI" w:eastAsia="Segoe UI" w:hAnsi="Segoe UI"/>
+          <w:b w:val="false"/>
+          <w:bCs w:val="false"/>
+          <w:color w:val="444444"/>
+          <w:sz w:val="25"/>
+          <w:szCs w:val="25"/>
         </w:rPr>
         <w:t xml:space="preserve">Betreuung: Herr Dr. Rosenschon</w:t>
       </w:r>
     </w:p>
     <w:p>
       <w:pPr>
-        <w:spacing w:after="60"/>
-        <w:jc w:val="center"/>
-      </w:pPr>
-      <w:r>
-        <w:rPr>
-          <w:rFonts w:ascii="Calibri" w:cs="Calibri" w:eastAsia="Calibri" w:hAnsi="Calibri"/>
-          <w:color w:val="404040"/>
-          <w:sz w:val="22"/>
-          <w:szCs w:val="22"/>
+        <w:spacing w:after="0" w:before="212" w:line="287" w:lineRule="exact"/>
+      </w:pPr>
+      <w:r>
+        <w:rPr>
+          <w:rFonts w:ascii="Segoe UI" w:cs="Segoe UI" w:eastAsia="Segoe UI" w:hAnsi="Segoe UI"/>
+          <w:b w:val="false"/>
+          <w:bCs w:val="false"/>
+          <w:color w:val="444444"/>
+          <w:sz w:val="25"/>
+          <w:szCs w:val="25"/>
         </w:rPr>
         <w:t xml:space="preserve">Bearbeitungszeitraum: 10.08.2026 – 19.03.2027</w:t>
       </w:r>
     </w:p>
-    <w:p/>
-    <w:p/>
-    <w:p/>
-    <w:p>
-      <w:pPr>
-        <w:jc w:val="center"/>
-      </w:pPr>
-      <w:r>
-        <w:rPr>
-          <w:rFonts w:ascii="Calibri" w:cs="Calibri" w:eastAsia="Calibri" w:hAnsi="Calibri"/>
-          <w:color w:val="808080"/>
+    <w:p>
+      <w:pPr>
+        <w:spacing w:after="0" w:before="1038" w:line="232" w:lineRule="exact"/>
+      </w:pPr>
+      <w:r>
+        <w:rPr>
+          <w:rFonts w:ascii="Segoe UI" w:cs="Segoe UI" w:eastAsia="Segoe UI" w:hAnsi="Segoe UI"/>
+          <w:b w:val="false"/>
+          <w:bCs w:val="false"/>
+          <w:color w:val="999999"/>
           <w:sz w:val="20"/>
           <w:szCs w:val="20"/>
         </w:rPr>
@@ -203,7 +253,7 @@
       <w:pPr>
         <w:sectPr>
           <w:pgSz w:w="11906" w:h="16838" w:orient="portrait"/>
-          <w:pgMar w:top="1418" w:right="1418" w:bottom="1418" w:left="1418" w:header="708" w:footer="708" w:gutter="0"/>
+          <w:pgMar w:top="0" w:right="912" w:bottom="0" w:left="912" w:header="708" w:footer="708" w:gutter="0"/>
           <w:pgNumType/>
           <w:docGrid w:linePitch="360"/>
         </w:sectPr>

</xml_diff>

<commit_message>
Die Word-Datei im Projekt nachgezogen
Beim letzten Mal war sie in Word offen und liess sich nicht ersetzen.

Co-Authored-By: Claude Opus 5 <noreply@anthropic.com>
</commit_message>
<xml_diff>
--- a/mappe/Zmaj Kapitel 1.docx
+++ b/mappe/Zmaj Kapitel 1.docx
@@ -1131,7 +1131,7 @@
           <w:sz w:val="22"/>
           <w:szCs w:val="22"/>
         </w:rPr>
-        <w:t xml:space="preserve">Gegenstand der Arbeit ist Zmaj, eine Android-Anwendung zum Erlernen der bosnischen Sprache. Zmaj ist das bosnische Wort für Drache. Den Anstoß gab ein privater Bedarf. Für Bosnisch war kein brauchbares Lernmaterial zu finden. Die großen Anbieter für Sprachlernsoftware führen die Sprache nicht.</w:t>
+        <w:t xml:space="preserve">Gegenstand der Arbeit ist Zmaj, eine Android-Anwendung zum Erlernen der bosnischen Sprache. Zmaj ist das bosnische Wort für Drache.</w:t>
       </w:r>
     </w:p>
     <w:p>
@@ -1145,7 +1145,49 @@
           <w:sz w:val="22"/>
           <w:szCs w:val="22"/>
         </w:rPr>
-        <w:t xml:space="preserve">Die Anwendung ist fertiggestellt und im Google Play Store veröffentlicht. Sie arbeitet vollständig auf dem Gerät, ohne Nutzerkonto und ohne Server. Der Funktionsumfang und die Anforderungen sind im Lastenheft in Kapitel 2 beschrieben.</w:t>
+        <w:t xml:space="preserve">Den Anstoß gab ein privater Bedarf. Für Bosnisch war kein brauchbares Lernmaterial zu finden. Die großen Anbieter für Sprachlernsoftware führen die Sprache nicht. Verfügbar sind im Wesentlichen Vokabellisten ohne Grammatik, ohne Tonspur und ohne aufeinander aufbauende Abschnitte.</w:t>
+      </w:r>
+    </w:p>
+    <w:p>
+      <w:pPr>
+        <w:spacing w:after="160" w:line="276"/>
+        <w:jc w:val="both"/>
+      </w:pPr>
+      <w:r>
+        <w:rPr>
+          <w:rFonts w:ascii="Calibri" w:cs="Calibri" w:eastAsia="Calibri" w:hAnsi="Calibri"/>
+          <w:sz w:val="22"/>
+          <w:szCs w:val="22"/>
+        </w:rPr>
+        <w:t xml:space="preserve">Die Anwendung richtet sich an Erwachsene mit persönlichem Bezug zu Bosnien und Herzegowina: an Partnerinnen und Partner in deutsch-bosnischen Beziehungen, an angeheiratete Familienangehörige und an Nachkommen der zweiten und dritten Einwanderergeneration, die Bosnisch verstehen, es aber nie lesen und schreiben gelernt haben. Der Schwerpunkt liegt in Deutschland. Die Bedienoberfläche gibt es zusätzlich in sieben weiteren Sprachen, weil die bosnische Diaspora vor allem in diesen Ländern lebt.</w:t>
+      </w:r>
+    </w:p>
+    <w:p>
+      <w:pPr>
+        <w:spacing w:after="160" w:line="276"/>
+        <w:jc w:val="both"/>
+      </w:pPr>
+      <w:r>
+        <w:rPr>
+          <w:rFonts w:ascii="Calibri" w:cs="Calibri" w:eastAsia="Calibri" w:hAnsi="Calibri"/>
+          <w:sz w:val="22"/>
+          <w:szCs w:val="22"/>
+        </w:rPr>
+        <w:t xml:space="preserve">Der Lernstoff führt vom Alltag bis zum Arbeitsvertrag. Geübt wird in fünf Formen: hören, schreiben, auswählen, Lücken füllen und sprechen. Zu jeder Vokabel gehört eine bosnische Tonspur.</w:t>
+      </w:r>
+    </w:p>
+    <w:p>
+      <w:pPr>
+        <w:spacing w:after="160" w:line="276"/>
+        <w:jc w:val="both"/>
+      </w:pPr>
+      <w:r>
+        <w:rPr>
+          <w:rFonts w:ascii="Calibri" w:cs="Calibri" w:eastAsia="Calibri" w:hAnsi="Calibri"/>
+          <w:sz w:val="22"/>
+          <w:szCs w:val="22"/>
+        </w:rPr>
+        <w:t xml:space="preserve">Die Anwendung ist fertiggestellt und im Google Play Store veröffentlicht. Sie arbeitet vollständig auf dem Gerät, ohne Nutzerkonto und ohne Server. Der Lernstand verlässt das Telefon nicht. Der vollständige Funktionsumfang und die Anforderungen sind im Lastenheft in Kapitel 2 beschrieben.</w:t>
       </w:r>
     </w:p>
     <w:sectPr>

</xml_diff>